<commit_message>
Added which microservice to do for each member
</commit_message>
<xml_diff>
--- a/EGT307_Contribution.docx
+++ b/EGT307_Contribution.docx
@@ -569,6 +569,13 @@
                       <w:color w:val="2E74B5" w:themeColor="accent1" w:themeShade="BF"/>
                     </w:rPr>
                   </w:pPr>
+                  <w:r>
+                    <w:rPr>
+                      <w:bCs/>
+                      <w:color w:val="2E74B5" w:themeColor="accent1" w:themeShade="BF"/>
+                    </w:rPr>
+                    <w:t>Machine Learning Services</w:t>
+                  </w:r>
                 </w:p>
               </w:tc>
             </w:tr>
@@ -631,6 +638,13 @@
                       <w:color w:val="2E74B5" w:themeColor="accent1" w:themeShade="BF"/>
                     </w:rPr>
                   </w:pPr>
+                  <w:r>
+                    <w:rPr>
+                      <w:bCs/>
+                      <w:color w:val="2E74B5" w:themeColor="accent1" w:themeShade="BF"/>
+                    </w:rPr>
+                    <w:t>Backend API</w:t>
+                  </w:r>
                 </w:p>
               </w:tc>
             </w:tr>
@@ -693,6 +707,13 @@
                       <w:color w:val="2E74B5" w:themeColor="accent1" w:themeShade="BF"/>
                     </w:rPr>
                   </w:pPr>
+                  <w:r>
+                    <w:rPr>
+                      <w:bCs/>
+                      <w:color w:val="2E74B5" w:themeColor="accent1" w:themeShade="BF"/>
+                    </w:rPr>
+                    <w:t>Frontend Dahboard</w:t>
+                  </w:r>
                 </w:p>
               </w:tc>
             </w:tr>
@@ -708,6 +729,13 @@
                       <w:color w:val="2E74B5" w:themeColor="accent1" w:themeShade="BF"/>
                     </w:rPr>
                   </w:pPr>
+                  <w:r>
+                    <w:rPr>
+                      <w:bCs/>
+                      <w:color w:val="2E74B5" w:themeColor="accent1" w:themeShade="BF"/>
+                    </w:rPr>
+                    <w:t>Louis</w:t>
+                  </w:r>
                 </w:p>
               </w:tc>
               <w:tc>
@@ -734,6 +762,13 @@
                       <w:color w:val="2E74B5" w:themeColor="accent1" w:themeShade="BF"/>
                     </w:rPr>
                   </w:pPr>
+                  <w:r>
+                    <w:rPr>
+                      <w:bCs/>
+                      <w:color w:val="2E74B5" w:themeColor="accent1" w:themeShade="BF"/>
+                    </w:rPr>
+                    <w:t>Database Services</w:t>
+                  </w:r>
                 </w:p>
               </w:tc>
             </w:tr>
@@ -2935,6 +2970,7 @@
   <w:style w:type="character" w:default="1" w:styleId="DefaultParagraphFont">
     <w:name w:val="Default Paragraph Font"/>
     <w:uiPriority w:val="1"/>
+    <w:semiHidden/>
     <w:unhideWhenUsed/>
   </w:style>
   <w:style w:type="table" w:default="1" w:styleId="TableNormal">

</xml_diff>